<commit_message>
AI Agent G4: system-decided evidence/criterion fit for DGCL scoring hints
Live test #4: qwen2.5:7b rephrased to "da thay ghi nhan trong quyet dinh" to pass the wording
checks for minutes-related criteria. Wording checks can always be gamed, so the system now decides
which dossier field can support which criterion (decision <-> "quyet dinh", work items <->
"phan cong/nhiem vu", TTSS <-> "phat hien/sai sot", recommendations <-> "kien nghi", objective,
scope, timeline <-> deadlines). Criteria with no fitting evidence are never sent to the model;
hints citing a non-fitting field are downgraded. Wording checks stay as a second layer.
Tests 227/227; docs updated.

Co-Authored-By: Claude Opus 5.5 <noreply@anthropic.com>
</commit_message>
<xml_diff>
--- a/docs/Huong-dan-su-dung-Tro-ly-AI-GD1-GD4.docx
+++ b/docs/Huong-dan-su-dung-Tro-ly-AI-GD1-GD4.docx
@@ -4828,6 +4828,18 @@
       </w:r>
       <w:r>
         <w:t xml:space="preserve"> chép toàn bộ gợi ý dạng văn bản nếu cần ghi chú.</w:t>
+      </w:r>
+    </w:p>
+    <w:p>
+      <w:pPr>
+        <w:pBdr>
+          <w:left w:val="single" w:color="2563EB" w:sz="18" w:space="6"/>
+        </w:pBdr>
+        <w:shd w:fill="EFF6FF" w:color="auto" w:val="clear"/>
+        <w:spacing w:before="80" w:after="160"/>
+      </w:pPr>
+      <w:r>
+        <w:t xml:space="preserve">Hệ thống chỉ hỏi AI về những tiêu chí mà hồ sơ đoàn có loại dữ liệu phù hợp: quyết định kiểm toán cho tiêu chí về quyết định; công việc được phân công cho tiêu chí về phân công/nhiệm vụ; TTSS cho tiêu chí về phát hiện/sai sót; kiến nghị cho tiêu chí về kiến nghị; mục tiêu, phạm vi; mốc thời gian cho tiêu chí về thời hạn. Các tiêu chí khác (vd lập biên bản, họp đoàn) hệ thống không có dữ liệu nên luôn là “Cần xem hồ sơ”.</w:t>
       </w:r>
     </w:p>
     <w:p>

</xml_diff>